<commit_message>
Simplify the three-picture step for students: fill-in story frames
Co-Authored-By: Claude Opus 5.5 <noreply@anthropic.com>
Claude-Session: https://claude.ai/code/session_01X6T188L1F16BrnZ92ZRBdN
</commit_message>
<xml_diff>
--- a/lesson/활동지_내가바로환경광고주인공.docx
+++ b/lesson/활동지_내가바로환경광고주인공.docx
@@ -752,14 +752,14 @@
           <w:color w:val="213A38"/>
           <w:sz w:val="26"/>
         </w:rPr>
-        <w:t>4. 광고 3장면</w:t>
+        <w:t>4. 그림 3장 이야기</w:t>
       </w:r>
       <w:r>
         <w:rPr>
           <w:color w:val="56706C"/>
           <w:sz w:val="18"/>
         </w:rPr>
-        <w:t xml:space="preserve">   문제 → 행동 → 결과</w:t>
+        <w:t xml:space="preserve">   [ ] 빈칸만 채워요 · 처음 → 중간 → 끝</w:t>
       </w:r>
     </w:p>
     <w:tbl>
@@ -771,9 +771,9 @@
         <w:tblLook w:firstColumn="1" w:firstRow="1" w:lastColumn="0" w:lastRow="0" w:noHBand="0" w:noVBand="1" w:val="04A0"/>
       </w:tblPr>
       <w:tblGrid>
-        <w:gridCol w:w="1701"/>
-        <w:gridCol w:w="3175"/>
-        <w:gridCol w:w="5216"/>
+        <w:gridCol w:w="1927"/>
+        <w:gridCol w:w="3061"/>
+        <w:gridCol w:w="5103"/>
       </w:tblGrid>
       <w:tr>
         <w:trPr>
@@ -781,7 +781,7 @@
         </w:trPr>
         <w:tc>
           <w:tcPr>
-            <w:tcW w:type="dxa" w:w="1701"/>
+            <w:tcW w:type="dxa" w:w="1928"/>
             <w:shd w:val="clear" w:color="auto" w:fill="E8F0EC"/>
             <w:vAlign w:val="center"/>
           </w:tcPr>
@@ -795,13 +795,13 @@
                 <w:b/>
                 <w:sz w:val="20"/>
               </w:rPr>
-              <w:t>장면</w:t>
+              <w:t>그림</w:t>
             </w:r>
           </w:p>
         </w:tc>
         <w:tc>
           <w:tcPr>
-            <w:tcW w:type="dxa" w:w="3175"/>
+            <w:tcW w:type="dxa" w:w="3061"/>
             <w:shd w:val="clear" w:color="auto" w:fill="E8F0EC"/>
             <w:vAlign w:val="center"/>
           </w:tcPr>
@@ -815,13 +815,13 @@
                 <w:b/>
                 <w:sz w:val="20"/>
               </w:rPr>
-              <w:t>이렇게 쓰면 돼요</w:t>
+              <w:t>예시 (민준이)</w:t>
             </w:r>
           </w:p>
         </w:tc>
         <w:tc>
           <w:tcPr>
-            <w:tcW w:type="dxa" w:w="5216"/>
+            <w:tcW w:type="dxa" w:w="5102"/>
             <w:shd w:val="clear" w:color="auto" w:fill="E8F0EC"/>
             <w:vAlign w:val="center"/>
           </w:tcPr>
@@ -846,7 +846,7 @@
         </w:trPr>
         <w:tc>
           <w:tcPr>
-            <w:tcW w:type="dxa" w:w="1701"/>
+            <w:tcW w:type="dxa" w:w="1928"/>
             <w:shd w:val="clear" w:color="auto" w:fill="FFF3C4"/>
             <w:vAlign w:val="center"/>
           </w:tcPr>
@@ -860,13 +860,13 @@
                 <w:b/>
                 <w:sz w:val="20"/>
               </w:rPr>
-              <w:t>① 문제</w:t>
+              <w:t>① 어? 문제 발견!</w:t>
             </w:r>
           </w:p>
         </w:tc>
         <w:tc>
           <w:tcPr>
-            <w:tcW w:type="dxa" w:w="3175"/>
+            <w:tcW w:type="dxa" w:w="3061"/>
             <w:vAlign w:val="center"/>
           </w:tcPr>
           <w:p>
@@ -876,13 +876,13 @@
                 <w:color w:val="56706C"/>
                 <w:sz w:val="18"/>
               </w:rPr>
-              <w:t>내 캐릭터가 쓰레기가 떠 있는 하천을 보고 깜짝 놀란다</w:t>
+              <w:t>나는 [ 안경다리 아래 하천 ]에서 [ 둥둥 뜬 쓰레기 ]를 보고 깜짝 놀라요</w:t>
             </w:r>
           </w:p>
         </w:tc>
         <w:tc>
           <w:tcPr>
-            <w:tcW w:type="dxa" w:w="5216"/>
+            <w:tcW w:type="dxa" w:w="5102"/>
             <w:vAlign w:val="center"/>
           </w:tcPr>
           <w:p>
@@ -891,6 +891,9 @@
               <w:rPr>
                 <w:sz w:val="20"/>
               </w:rPr>
+              <w:t>나는 [                    ]에서</w:t>
+              <w:br/>
+              <w:t>[                    ]를 보고 깜짝 놀라요</w:t>
             </w:r>
           </w:p>
         </w:tc>
@@ -901,7 +904,7 @@
         </w:trPr>
         <w:tc>
           <w:tcPr>
-            <w:tcW w:type="dxa" w:w="1701"/>
+            <w:tcW w:type="dxa" w:w="1928"/>
             <w:shd w:val="clear" w:color="auto" w:fill="FFF3C4"/>
             <w:vAlign w:val="center"/>
           </w:tcPr>
@@ -915,13 +918,13 @@
                 <w:b/>
                 <w:sz w:val="20"/>
               </w:rPr>
-              <w:t>② 행동</w:t>
+              <w:t>② 내가 해결!</w:t>
             </w:r>
           </w:p>
         </w:tc>
         <w:tc>
           <w:tcPr>
-            <w:tcW w:type="dxa" w:w="3175"/>
+            <w:tcW w:type="dxa" w:w="3061"/>
             <w:vAlign w:val="center"/>
           </w:tcPr>
           <w:p>
@@ -931,13 +934,13 @@
                 <w:color w:val="56706C"/>
                 <w:sz w:val="18"/>
               </w:rPr>
-              <w:t>내 캐릭터가 하천의 쓰레기를 주워 봉투에 담는다</w:t>
+              <w:t>나는 [ 쓰레기를 주워 봉투에 담아요 ]</w:t>
             </w:r>
           </w:p>
         </w:tc>
         <w:tc>
           <w:tcPr>
-            <w:tcW w:type="dxa" w:w="5216"/>
+            <w:tcW w:type="dxa" w:w="5102"/>
             <w:vAlign w:val="center"/>
           </w:tcPr>
           <w:p>
@@ -946,6 +949,7 @@
               <w:rPr>
                 <w:sz w:val="20"/>
               </w:rPr>
+              <w:t>나는 [                              ]</w:t>
             </w:r>
           </w:p>
         </w:tc>
@@ -956,7 +960,7 @@
         </w:trPr>
         <w:tc>
           <w:tcPr>
-            <w:tcW w:type="dxa" w:w="1701"/>
+            <w:tcW w:type="dxa" w:w="1928"/>
             <w:shd w:val="clear" w:color="auto" w:fill="FFF3C4"/>
             <w:vAlign w:val="center"/>
           </w:tcPr>
@@ -970,13 +974,13 @@
                 <w:b/>
                 <w:sz w:val="20"/>
               </w:rPr>
-              <w:t>③ 결과</w:t>
+              <w:t>③ 짠! 바뀐 우리 동네</w:t>
             </w:r>
           </w:p>
         </w:tc>
         <w:tc>
           <w:tcPr>
-            <w:tcW w:type="dxa" w:w="3175"/>
+            <w:tcW w:type="dxa" w:w="3061"/>
             <w:vAlign w:val="center"/>
           </w:tcPr>
           <w:p>
@@ -986,13 +990,13 @@
                 <w:color w:val="56706C"/>
                 <w:sz w:val="18"/>
               </w:rPr>
-              <w:t>맑아진 하천에서 물고기가 헤엄치고 내 캐릭터가 웃는다</w:t>
+              <w:t>[ 하천 ]이 깨끗해지고 나는 활짝 웃어요</w:t>
             </w:r>
           </w:p>
         </w:tc>
         <w:tc>
           <w:tcPr>
-            <w:tcW w:type="dxa" w:w="5216"/>
+            <w:tcW w:type="dxa" w:w="5102"/>
             <w:vAlign w:val="center"/>
           </w:tcPr>
           <w:p>
@@ -1001,6 +1005,9 @@
               <w:rPr>
                 <w:sz w:val="20"/>
               </w:rPr>
+              <w:t>[                    ]이 깨끗해지고</w:t>
+              <w:br/>
+              <w:t>나는 활짝 웃어요</w:t>
             </w:r>
           </w:p>
         </w:tc>

</xml_diff>

<commit_message>
Lecture slides and worksheet follow the six Gemini questions in order
Co-Authored-By: Claude Opus 5.5 <noreply@anthropic.com>
Claude-Session: https://claude.ai/code/session_01X6T188L1F16BrnZ92ZRBdN
</commit_message>
<xml_diff>
--- a/lesson/활동지_내가바로환경광고주인공.docx
+++ b/lesson/활동지_내가바로환경광고주인공.docx
@@ -123,14 +123,14 @@
           <w:color w:val="213A38"/>
           <w:sz w:val="26"/>
         </w:rPr>
-        <w:t>1. 게임에서 찾은 우리 동네 문제</w:t>
+        <w:t>1. 내가 할 환경 행동</w:t>
       </w:r>
       <w:r>
         <w:rPr>
           <w:color w:val="56706C"/>
           <w:sz w:val="18"/>
         </w:rPr>
-        <w:t xml:space="preserve">   게임에서 가장 바꾸고 싶었던 것 하나</w:t>
+        <w:t xml:space="preserve">   게임에서 본 문제 중 내가 직접 해 보고 싶은 행동</w:t>
       </w:r>
     </w:p>
     <w:tbl>
@@ -142,16 +142,17 @@
         <w:tblLook w:firstColumn="1" w:firstRow="1" w:lastColumn="0" w:lastRow="0" w:noHBand="0" w:noVBand="1" w:val="04A0"/>
       </w:tblPr>
       <w:tblGrid>
-        <w:gridCol w:w="2041"/>
-        <w:gridCol w:w="8051"/>
+        <w:gridCol w:w="1701"/>
+        <w:gridCol w:w="3061"/>
+        <w:gridCol w:w="5329"/>
       </w:tblGrid>
       <w:tr>
         <w:trPr>
-          <w:trHeight w:val="567"/>
+          <w:trHeight w:val="454"/>
         </w:trPr>
         <w:tc>
           <w:tcPr>
-            <w:tcW w:type="dxa" w:w="2041"/>
+            <w:tcW w:type="dxa" w:w="1701"/>
             <w:shd w:val="clear" w:color="auto" w:fill="FFF3C4"/>
             <w:vAlign w:val="center"/>
           </w:tcPr>
@@ -165,52 +166,29 @@
                 <w:b/>
                 <w:sz w:val="20"/>
               </w:rPr>
-              <w:t>바꾸고 싶은 것</w:t>
+              <w:t>내가 할 행동</w:t>
             </w:r>
           </w:p>
         </w:tc>
         <w:tc>
           <w:tcPr>
-            <w:tcW w:type="dxa" w:w="8050"/>
+            <w:tcW w:type="dxa" w:w="3061"/>
             <w:vAlign w:val="center"/>
           </w:tcPr>
           <w:p>
             <w:r/>
             <w:r>
               <w:rPr>
-                <w:sz w:val="20"/>
+                <w:color w:val="56706C"/>
+                <w:sz w:val="18"/>
               </w:rPr>
-            </w:r>
-          </w:p>
-        </w:tc>
-      </w:tr>
-      <w:tr>
-        <w:trPr>
-          <w:trHeight w:val="567"/>
-        </w:trPr>
-        <w:tc>
-          <w:tcPr>
-            <w:tcW w:type="dxa" w:w="2041"/>
-            <w:shd w:val="clear" w:color="auto" w:fill="FFF3C4"/>
-            <w:vAlign w:val="center"/>
-          </w:tcPr>
-          <w:p>
-            <w:pPr>
-              <w:jc w:val="center"/>
-            </w:pPr>
-            <w:r/>
-            <w:r>
-              <w:rPr>
-                <w:b/>
-                <w:sz w:val="20"/>
-              </w:rPr>
-              <w:t>바뀌면 좋은 점</w:t>
+              <w:t>예) 하천 쓰레기 줍기</w:t>
             </w:r>
           </w:p>
         </w:tc>
         <w:tc>
           <w:tcPr>
-            <w:tcW w:type="dxa" w:w="8050"/>
+            <w:tcW w:type="dxa" w:w="5329"/>
             <w:vAlign w:val="center"/>
           </w:tcPr>
           <w:p>
@@ -254,8 +232,8 @@
       </w:tblPr>
       <w:tblGrid>
         <w:gridCol w:w="1701"/>
-        <w:gridCol w:w="3175"/>
-        <w:gridCol w:w="5216"/>
+        <w:gridCol w:w="3061"/>
+        <w:gridCol w:w="5329"/>
       </w:tblGrid>
       <w:tr>
         <w:trPr>
@@ -283,7 +261,7 @@
         </w:tc>
         <w:tc>
           <w:tcPr>
-            <w:tcW w:type="dxa" w:w="3175"/>
+            <w:tcW w:type="dxa" w:w="3061"/>
             <w:shd w:val="clear" w:color="auto" w:fill="E8F0EC"/>
             <w:vAlign w:val="center"/>
           </w:tcPr>
@@ -297,13 +275,13 @@
                 <w:b/>
                 <w:sz w:val="20"/>
               </w:rPr>
-              <w:t>예시 (동이)</w:t>
+              <w:t>예시</w:t>
             </w:r>
           </w:p>
         </w:tc>
         <w:tc>
           <w:tcPr>
-            <w:tcW w:type="dxa" w:w="5216"/>
+            <w:tcW w:type="dxa" w:w="5329"/>
             <w:shd w:val="clear" w:color="auto" w:fill="E8F0EC"/>
             <w:vAlign w:val="center"/>
           </w:tcPr>
@@ -324,7 +302,7 @@
       </w:tr>
       <w:tr>
         <w:trPr>
-          <w:trHeight w:val="482"/>
+          <w:trHeight w:val="408"/>
         </w:trPr>
         <w:tc>
           <w:tcPr>
@@ -348,7 +326,7 @@
         </w:tc>
         <w:tc>
           <w:tcPr>
-            <w:tcW w:type="dxa" w:w="3175"/>
+            <w:tcW w:type="dxa" w:w="3061"/>
             <w:vAlign w:val="center"/>
           </w:tcPr>
           <w:p>
@@ -364,7 +342,7 @@
         </w:tc>
         <w:tc>
           <w:tcPr>
-            <w:tcW w:type="dxa" w:w="5216"/>
+            <w:tcW w:type="dxa" w:w="5329"/>
             <w:vAlign w:val="center"/>
           </w:tcPr>
           <w:p>
@@ -379,7 +357,7 @@
       </w:tr>
       <w:tr>
         <w:trPr>
-          <w:trHeight w:val="482"/>
+          <w:trHeight w:val="408"/>
         </w:trPr>
         <w:tc>
           <w:tcPr>
@@ -403,7 +381,7 @@
         </w:tc>
         <w:tc>
           <w:tcPr>
-            <w:tcW w:type="dxa" w:w="3175"/>
+            <w:tcW w:type="dxa" w:w="3061"/>
             <w:vAlign w:val="center"/>
           </w:tcPr>
           <w:p>
@@ -419,7 +397,7 @@
         </w:tc>
         <w:tc>
           <w:tcPr>
-            <w:tcW w:type="dxa" w:w="5216"/>
+            <w:tcW w:type="dxa" w:w="5329"/>
             <w:vAlign w:val="center"/>
           </w:tcPr>
           <w:p>
@@ -434,7 +412,7 @@
       </w:tr>
       <w:tr>
         <w:trPr>
-          <w:trHeight w:val="482"/>
+          <w:trHeight w:val="408"/>
         </w:trPr>
         <w:tc>
           <w:tcPr>
@@ -458,7 +436,7 @@
         </w:tc>
         <w:tc>
           <w:tcPr>
-            <w:tcW w:type="dxa" w:w="3175"/>
+            <w:tcW w:type="dxa" w:w="3061"/>
             <w:vAlign w:val="center"/>
           </w:tcPr>
           <w:p>
@@ -474,7 +452,7 @@
         </w:tc>
         <w:tc>
           <w:tcPr>
-            <w:tcW w:type="dxa" w:w="5216"/>
+            <w:tcW w:type="dxa" w:w="5329"/>
             <w:vAlign w:val="center"/>
           </w:tcPr>
           <w:p>
@@ -489,7 +467,7 @@
       </w:tr>
       <w:tr>
         <w:trPr>
-          <w:trHeight w:val="482"/>
+          <w:trHeight w:val="408"/>
         </w:trPr>
         <w:tc>
           <w:tcPr>
@@ -513,7 +491,7 @@
         </w:tc>
         <w:tc>
           <w:tcPr>
-            <w:tcW w:type="dxa" w:w="3175"/>
+            <w:tcW w:type="dxa" w:w="3061"/>
             <w:vAlign w:val="center"/>
           </w:tcPr>
           <w:p>
@@ -523,13 +501,13 @@
                 <w:color w:val="56706C"/>
                 <w:sz w:val="18"/>
               </w:rPr>
-              <w:t>밝은 표정, 초록 잎 무늬</w:t>
+              <w:t>밝은 표정</w:t>
             </w:r>
           </w:p>
         </w:tc>
         <w:tc>
           <w:tcPr>
-            <w:tcW w:type="dxa" w:w="5216"/>
+            <w:tcW w:type="dxa" w:w="5329"/>
             <w:vAlign w:val="center"/>
           </w:tcPr>
           <w:p>
@@ -544,7 +522,7 @@
       </w:tr>
       <w:tr>
         <w:trPr>
-          <w:trHeight w:val="482"/>
+          <w:trHeight w:val="408"/>
         </w:trPr>
         <w:tc>
           <w:tcPr>
@@ -568,7 +546,7 @@
         </w:tc>
         <w:tc>
           <w:tcPr>
-            <w:tcW w:type="dxa" w:w="3175"/>
+            <w:tcW w:type="dxa" w:w="3061"/>
             <w:vAlign w:val="center"/>
           </w:tcPr>
           <w:p>
@@ -578,13 +556,13 @@
                 <w:color w:val="56706C"/>
                 <w:sz w:val="18"/>
               </w:rPr>
-              <w:t>동이</w:t>
+              <w:t>민준이</w:t>
             </w:r>
           </w:p>
         </w:tc>
         <w:tc>
           <w:tcPr>
-            <w:tcW w:type="dxa" w:w="5216"/>
+            <w:tcW w:type="dxa" w:w="5329"/>
             <w:vAlign w:val="center"/>
           </w:tcPr>
           <w:p>
@@ -608,14 +586,14 @@
           <w:color w:val="213A38"/>
           <w:sz w:val="26"/>
         </w:rPr>
-        <w:t>3. 광고 무대가 될 신동읍 장소</w:t>
+        <w:t>3. 내 행동을 할 신동읍 장소</w:t>
       </w:r>
       <w:r>
         <w:rPr>
           <w:color w:val="56706C"/>
           <w:sz w:val="18"/>
         </w:rPr>
-        <w:t xml:space="preserve">   인터넷에서 찾은 장소 사진</w:t>
+        <w:t xml:space="preserve">   인터넷에서 장소 사진을 찾아 저장해요</w:t>
       </w:r>
     </w:p>
     <w:tbl>
@@ -628,12 +606,12 @@
       </w:tblPr>
       <w:tblGrid>
         <w:gridCol w:w="1701"/>
-        <w:gridCol w:w="3175"/>
-        <w:gridCol w:w="5216"/>
+        <w:gridCol w:w="3061"/>
+        <w:gridCol w:w="5329"/>
       </w:tblGrid>
       <w:tr>
         <w:trPr>
-          <w:trHeight w:val="482"/>
+          <w:trHeight w:val="454"/>
         </w:trPr>
         <w:tc>
           <w:tcPr>
@@ -657,7 +635,7 @@
         </w:tc>
         <w:tc>
           <w:tcPr>
-            <w:tcW w:type="dxa" w:w="3175"/>
+            <w:tcW w:type="dxa" w:w="3061"/>
             <w:vAlign w:val="center"/>
           </w:tcPr>
           <w:p>
@@ -673,62 +651,7 @@
         </w:tc>
         <w:tc>
           <w:tcPr>
-            <w:tcW w:type="dxa" w:w="5216"/>
-            <w:vAlign w:val="center"/>
-          </w:tcPr>
-          <w:p>
-            <w:r/>
-            <w:r>
-              <w:rPr>
-                <w:sz w:val="20"/>
-              </w:rPr>
-            </w:r>
-          </w:p>
-        </w:tc>
-      </w:tr>
-      <w:tr>
-        <w:trPr>
-          <w:trHeight w:val="482"/>
-        </w:trPr>
-        <w:tc>
-          <w:tcPr>
-            <w:tcW w:type="dxa" w:w="1701"/>
-            <w:shd w:val="clear" w:color="auto" w:fill="FFF3C4"/>
-            <w:vAlign w:val="center"/>
-          </w:tcPr>
-          <w:p>
-            <w:pPr>
-              <w:jc w:val="center"/>
-            </w:pPr>
-            <w:r/>
-            <w:r>
-              <w:rPr>
-                <w:b/>
-                <w:sz w:val="20"/>
-              </w:rPr>
-              <w:t>고른 이유</w:t>
-            </w:r>
-          </w:p>
-        </w:tc>
-        <w:tc>
-          <w:tcPr>
-            <w:tcW w:type="dxa" w:w="3175"/>
-            <w:vAlign w:val="center"/>
-          </w:tcPr>
-          <w:p>
-            <w:r/>
-            <w:r>
-              <w:rPr>
-                <w:color w:val="56706C"/>
-                <w:sz w:val="18"/>
-              </w:rPr>
-              <w:t>예) 하천 쓰레기 줍기와 어울려서</w:t>
-            </w:r>
-          </w:p>
-        </w:tc>
-        <w:tc>
-          <w:tcPr>
-            <w:tcW w:type="dxa" w:w="5216"/>
+            <w:tcW w:type="dxa" w:w="5329"/>
             <w:vAlign w:val="center"/>
           </w:tcPr>
           <w:p>
@@ -752,14 +675,14 @@
           <w:color w:val="213A38"/>
           <w:sz w:val="26"/>
         </w:rPr>
-        <w:t>4. 그림 3장 이야기</w:t>
+        <w:t>4. 내 행동 3단계</w:t>
       </w:r>
       <w:r>
         <w:rPr>
           <w:color w:val="56706C"/>
           <w:sz w:val="18"/>
         </w:rPr>
-        <w:t xml:space="preserve">   [ ] 빈칸만 채워요 · 처음 → 중간 → 끝</w:t>
+        <w:t xml:space="preserve">   제미나이 질문 ②의 답을 옮겨 적어요 = 그림 3장</w:t>
       </w:r>
     </w:p>
     <w:tbl>
@@ -771,9 +694,9 @@
         <w:tblLook w:firstColumn="1" w:firstRow="1" w:lastColumn="0" w:lastRow="0" w:noHBand="0" w:noVBand="1" w:val="04A0"/>
       </w:tblPr>
       <w:tblGrid>
-        <w:gridCol w:w="1927"/>
+        <w:gridCol w:w="1701"/>
         <w:gridCol w:w="3061"/>
-        <w:gridCol w:w="5103"/>
+        <w:gridCol w:w="5329"/>
       </w:tblGrid>
       <w:tr>
         <w:trPr>
@@ -781,7 +704,7 @@
         </w:trPr>
         <w:tc>
           <w:tcPr>
-            <w:tcW w:type="dxa" w:w="1928"/>
+            <w:tcW w:type="dxa" w:w="1701"/>
             <w:shd w:val="clear" w:color="auto" w:fill="E8F0EC"/>
             <w:vAlign w:val="center"/>
           </w:tcPr>
@@ -815,13 +738,13 @@
                 <w:b/>
                 <w:sz w:val="20"/>
               </w:rPr>
-              <w:t>예시 (민준이)</w:t>
+              <w:t>예시</w:t>
             </w:r>
           </w:p>
         </w:tc>
         <w:tc>
           <w:tcPr>
-            <w:tcW w:type="dxa" w:w="5102"/>
+            <w:tcW w:type="dxa" w:w="5329"/>
             <w:shd w:val="clear" w:color="auto" w:fill="E8F0EC"/>
             <w:vAlign w:val="center"/>
           </w:tcPr>
@@ -842,11 +765,11 @@
       </w:tr>
       <w:tr>
         <w:trPr>
-          <w:trHeight w:val="709"/>
+          <w:trHeight w:val="539"/>
         </w:trPr>
         <w:tc>
           <w:tcPr>
-            <w:tcW w:type="dxa" w:w="1928"/>
+            <w:tcW w:type="dxa" w:w="1701"/>
             <w:shd w:val="clear" w:color="auto" w:fill="FFF3C4"/>
             <w:vAlign w:val="center"/>
           </w:tcPr>
@@ -860,7 +783,7 @@
                 <w:b/>
                 <w:sz w:val="20"/>
               </w:rPr>
-              <w:t>① 어? 문제 발견!</w:t>
+              <w:t>1단계</w:t>
             </w:r>
           </w:p>
         </w:tc>
@@ -876,13 +799,13 @@
                 <w:color w:val="56706C"/>
                 <w:sz w:val="18"/>
               </w:rPr>
-              <w:t>나는 [ 안경다리 아래 하천 ]에서 [ 둥둥 뜬 쓰레기 ]를 보고 깜짝 놀라요</w:t>
+              <w:t>하천에 떠 있는 쓰레기를 발견해요</w:t>
             </w:r>
           </w:p>
         </w:tc>
         <w:tc>
           <w:tcPr>
-            <w:tcW w:type="dxa" w:w="5102"/>
+            <w:tcW w:type="dxa" w:w="5329"/>
             <w:vAlign w:val="center"/>
           </w:tcPr>
           <w:p>
@@ -891,20 +814,17 @@
               <w:rPr>
                 <w:sz w:val="20"/>
               </w:rPr>
-              <w:t>나는 [                    ]에서</w:t>
-              <w:br/>
-              <w:t>[                    ]를 보고 깜짝 놀라요</w:t>
             </w:r>
           </w:p>
         </w:tc>
       </w:tr>
       <w:tr>
         <w:trPr>
-          <w:trHeight w:val="709"/>
+          <w:trHeight w:val="539"/>
         </w:trPr>
         <w:tc>
           <w:tcPr>
-            <w:tcW w:type="dxa" w:w="1928"/>
+            <w:tcW w:type="dxa" w:w="1701"/>
             <w:shd w:val="clear" w:color="auto" w:fill="FFF3C4"/>
             <w:vAlign w:val="center"/>
           </w:tcPr>
@@ -918,7 +838,7 @@
                 <w:b/>
                 <w:sz w:val="20"/>
               </w:rPr>
-              <w:t>② 내가 해결!</w:t>
+              <w:t>2단계</w:t>
             </w:r>
           </w:p>
         </w:tc>
@@ -934,13 +854,13 @@
                 <w:color w:val="56706C"/>
                 <w:sz w:val="18"/>
               </w:rPr>
-              <w:t>나는 [ 쓰레기를 주워 봉투에 담아요 ]</w:t>
+              <w:t>집게로 쓰레기를 주워 봉투에 담아요</w:t>
             </w:r>
           </w:p>
         </w:tc>
         <w:tc>
           <w:tcPr>
-            <w:tcW w:type="dxa" w:w="5102"/>
+            <w:tcW w:type="dxa" w:w="5329"/>
             <w:vAlign w:val="center"/>
           </w:tcPr>
           <w:p>
@@ -949,18 +869,17 @@
               <w:rPr>
                 <w:sz w:val="20"/>
               </w:rPr>
-              <w:t>나는 [                              ]</w:t>
             </w:r>
           </w:p>
         </w:tc>
       </w:tr>
       <w:tr>
         <w:trPr>
-          <w:trHeight w:val="709"/>
+          <w:trHeight w:val="539"/>
         </w:trPr>
         <w:tc>
           <w:tcPr>
-            <w:tcW w:type="dxa" w:w="1928"/>
+            <w:tcW w:type="dxa" w:w="1701"/>
             <w:shd w:val="clear" w:color="auto" w:fill="FFF3C4"/>
             <w:vAlign w:val="center"/>
           </w:tcPr>
@@ -974,7 +893,7 @@
                 <w:b/>
                 <w:sz w:val="20"/>
               </w:rPr>
-              <w:t>③ 짠! 바뀐 우리 동네</w:t>
+              <w:t>3단계</w:t>
             </w:r>
           </w:p>
         </w:tc>
@@ -990,13 +909,13 @@
                 <w:color w:val="56706C"/>
                 <w:sz w:val="18"/>
               </w:rPr>
-              <w:t>[ 하천 ]이 깨끗해지고 나는 활짝 웃어요</w:t>
+              <w:t>깨끗해진 하천 앞에서 활짝 웃어요</w:t>
             </w:r>
           </w:p>
         </w:tc>
         <w:tc>
           <w:tcPr>
-            <w:tcW w:type="dxa" w:w="5102"/>
+            <w:tcW w:type="dxa" w:w="5329"/>
             <w:vAlign w:val="center"/>
           </w:tcPr>
           <w:p>
@@ -1005,9 +924,6 @@
               <w:rPr>
                 <w:sz w:val="20"/>
               </w:rPr>
-              <w:t>[                    ]이 깨끗해지고</w:t>
-              <w:br/>
-              <w:t>나는 활짝 웃어요</w:t>
             </w:r>
           </w:p>
         </w:tc>
@@ -1023,7 +939,252 @@
           <w:color w:val="213A38"/>
           <w:sz w:val="26"/>
         </w:rPr>
-        <w:t>5. 광고 문구</w:t>
+        <w:t>5. 제미나이 질문 체크</w:t>
+      </w:r>
+      <w:r>
+        <w:rPr>
+          <w:color w:val="56706C"/>
+          <w:sz w:val="18"/>
+        </w:rPr>
+        <w:t xml:space="preserve">   같은 대화창에서 순서대로! 하고 나면 ✓</w:t>
+      </w:r>
+    </w:p>
+    <w:tbl>
+      <w:tblPr>
+        <w:tblStyle w:val="TableGrid"/>
+        <w:tblW w:type="auto" w:w="0"/>
+        <w:jc w:val="center"/>
+        <w:tblLayout w:type="fixed"/>
+        <w:tblLook w:firstColumn="1" w:firstRow="1" w:lastColumn="0" w:lastRow="0" w:noHBand="0" w:noVBand="1" w:val="04A0"/>
+      </w:tblPr>
+      <w:tblGrid>
+        <w:gridCol w:w="4139"/>
+        <w:gridCol w:w="907"/>
+        <w:gridCol w:w="4139"/>
+        <w:gridCol w:w="907"/>
+      </w:tblGrid>
+      <w:tr>
+        <w:trPr>
+          <w:trHeight w:val="397"/>
+        </w:trPr>
+        <w:tc>
+          <w:tcPr>
+            <w:tcW w:type="dxa" w:w="4139"/>
+            <w:shd w:val="clear" w:color="auto" w:fill="FFF3C4"/>
+            <w:vAlign w:val="center"/>
+          </w:tcPr>
+          <w:p>
+            <w:pPr>
+              <w:jc w:val="center"/>
+            </w:pPr>
+            <w:r/>
+            <w:r>
+              <w:rPr>
+                <w:b/>
+                <w:sz w:val="20"/>
+              </w:rPr>
+              <w:t>①  내 캐릭터 그려 줘</w:t>
+            </w:r>
+          </w:p>
+        </w:tc>
+        <w:tc>
+          <w:tcPr>
+            <w:tcW w:type="dxa" w:w="907"/>
+            <w:vAlign w:val="center"/>
+          </w:tcPr>
+          <w:p>
+            <w:r/>
+            <w:r>
+              <w:rPr>
+                <w:sz w:val="20"/>
+              </w:rPr>
+              <w:t>□</w:t>
+            </w:r>
+          </w:p>
+        </w:tc>
+        <w:tc>
+          <w:tcPr>
+            <w:tcW w:type="dxa" w:w="4139"/>
+            <w:vAlign w:val="center"/>
+          </w:tcPr>
+          <w:p>
+            <w:r/>
+            <w:r>
+              <w:rPr>
+                <w:sz w:val="20"/>
+              </w:rPr>
+              <w:t>④  2단계 그림 그려 줘</w:t>
+            </w:r>
+          </w:p>
+        </w:tc>
+        <w:tc>
+          <w:tcPr>
+            <w:tcW w:type="dxa" w:w="907"/>
+            <w:vAlign w:val="center"/>
+          </w:tcPr>
+          <w:p>
+            <w:r/>
+            <w:r>
+              <w:rPr>
+                <w:sz w:val="20"/>
+              </w:rPr>
+              <w:t>□</w:t>
+            </w:r>
+          </w:p>
+        </w:tc>
+      </w:tr>
+      <w:tr>
+        <w:trPr>
+          <w:trHeight w:val="397"/>
+        </w:trPr>
+        <w:tc>
+          <w:tcPr>
+            <w:tcW w:type="dxa" w:w="4139"/>
+            <w:shd w:val="clear" w:color="auto" w:fill="FFF3C4"/>
+            <w:vAlign w:val="center"/>
+          </w:tcPr>
+          <w:p>
+            <w:pPr>
+              <w:jc w:val="center"/>
+            </w:pPr>
+            <w:r/>
+            <w:r>
+              <w:rPr>
+                <w:b/>
+                <w:sz w:val="20"/>
+              </w:rPr>
+              <w:t>②  내 행동을 3단계로 나눠 줘</w:t>
+            </w:r>
+          </w:p>
+        </w:tc>
+        <w:tc>
+          <w:tcPr>
+            <w:tcW w:type="dxa" w:w="907"/>
+            <w:vAlign w:val="center"/>
+          </w:tcPr>
+          <w:p>
+            <w:r/>
+            <w:r>
+              <w:rPr>
+                <w:sz w:val="20"/>
+              </w:rPr>
+              <w:t>□</w:t>
+            </w:r>
+          </w:p>
+        </w:tc>
+        <w:tc>
+          <w:tcPr>
+            <w:tcW w:type="dxa" w:w="4139"/>
+            <w:vAlign w:val="center"/>
+          </w:tcPr>
+          <w:p>
+            <w:r/>
+            <w:r>
+              <w:rPr>
+                <w:sz w:val="20"/>
+              </w:rPr>
+              <w:t>⑤  3단계 그림 그려 줘</w:t>
+            </w:r>
+          </w:p>
+        </w:tc>
+        <w:tc>
+          <w:tcPr>
+            <w:tcW w:type="dxa" w:w="907"/>
+            <w:vAlign w:val="center"/>
+          </w:tcPr>
+          <w:p>
+            <w:r/>
+            <w:r>
+              <w:rPr>
+                <w:sz w:val="20"/>
+              </w:rPr>
+              <w:t>□</w:t>
+            </w:r>
+          </w:p>
+        </w:tc>
+      </w:tr>
+      <w:tr>
+        <w:trPr>
+          <w:trHeight w:val="397"/>
+        </w:trPr>
+        <w:tc>
+          <w:tcPr>
+            <w:tcW w:type="dxa" w:w="4139"/>
+            <w:shd w:val="clear" w:color="auto" w:fill="FFF3C4"/>
+            <w:vAlign w:val="center"/>
+          </w:tcPr>
+          <w:p>
+            <w:pPr>
+              <w:jc w:val="center"/>
+            </w:pPr>
+            <w:r/>
+            <w:r>
+              <w:rPr>
+                <w:b/>
+                <w:sz w:val="20"/>
+              </w:rPr>
+              <w:t>③  1단계 그림 그려 줘 (장소 사진 첨부)</w:t>
+            </w:r>
+          </w:p>
+        </w:tc>
+        <w:tc>
+          <w:tcPr>
+            <w:tcW w:type="dxa" w:w="907"/>
+            <w:vAlign w:val="center"/>
+          </w:tcPr>
+          <w:p>
+            <w:r/>
+            <w:r>
+              <w:rPr>
+                <w:sz w:val="20"/>
+              </w:rPr>
+              <w:t>□</w:t>
+            </w:r>
+          </w:p>
+        </w:tc>
+        <w:tc>
+          <w:tcPr>
+            <w:tcW w:type="dxa" w:w="4139"/>
+            <w:vAlign w:val="center"/>
+          </w:tcPr>
+          <w:p>
+            <w:r/>
+            <w:r>
+              <w:rPr>
+                <w:sz w:val="20"/>
+              </w:rPr>
+              <w:t>⑥  비즈용 영어 문장 3개 만들어 줘</w:t>
+            </w:r>
+          </w:p>
+        </w:tc>
+        <w:tc>
+          <w:tcPr>
+            <w:tcW w:type="dxa" w:w="907"/>
+            <w:vAlign w:val="center"/>
+          </w:tcPr>
+          <w:p>
+            <w:r/>
+            <w:r>
+              <w:rPr>
+                <w:sz w:val="20"/>
+              </w:rPr>
+              <w:t>□</w:t>
+            </w:r>
+          </w:p>
+        </w:tc>
+      </w:tr>
+    </w:tbl>
+    <w:p>
+      <w:pPr>
+        <w:spacing w:before="180" w:after="60"/>
+      </w:pPr>
+      <w:r>
+        <w:rPr>
+          <w:b/>
+          <w:color w:val="213A38"/>
+          <w:sz w:val="26"/>
+        </w:rPr>
+        <w:t>6. 광고 문구</w:t>
       </w:r>
       <w:r>
         <w:rPr>
@@ -1043,12 +1204,12 @@
       </w:tblPr>
       <w:tblGrid>
         <w:gridCol w:w="1701"/>
-        <w:gridCol w:w="3175"/>
-        <w:gridCol w:w="5216"/>
+        <w:gridCol w:w="3061"/>
+        <w:gridCol w:w="5329"/>
       </w:tblGrid>
       <w:tr>
         <w:trPr>
-          <w:trHeight w:val="567"/>
+          <w:trHeight w:val="510"/>
         </w:trPr>
         <w:tc>
           <w:tcPr>
@@ -1072,7 +1233,7 @@
         </w:tc>
         <w:tc>
           <w:tcPr>
-            <w:tcW w:type="dxa" w:w="3175"/>
+            <w:tcW w:type="dxa" w:w="3061"/>
             <w:vAlign w:val="center"/>
           </w:tcPr>
           <w:p>
@@ -1088,7 +1249,7 @@
         </w:tc>
         <w:tc>
           <w:tcPr>
-            <w:tcW w:type="dxa" w:w="5216"/>
+            <w:tcW w:type="dxa" w:w="5329"/>
             <w:vAlign w:val="center"/>
           </w:tcPr>
           <w:p>
@@ -1112,7 +1273,7 @@
           <w:color w:val="213A38"/>
           <w:sz w:val="26"/>
         </w:rPr>
-        <w:t>6. 영상 제목과 오늘 한 줄 소감</w:t>
+        <w:t>7. 영상 제목과 오늘 한 줄 소감</w:t>
       </w:r>
     </w:p>
     <w:tbl>
@@ -1129,7 +1290,7 @@
       </w:tblGrid>
       <w:tr>
         <w:trPr>
-          <w:trHeight w:val="567"/>
+          <w:trHeight w:val="510"/>
         </w:trPr>
         <w:tc>
           <w:tcPr>
@@ -1168,7 +1329,7 @@
       </w:tr>
       <w:tr>
         <w:trPr>
-          <w:trHeight w:val="567"/>
+          <w:trHeight w:val="510"/>
         </w:trPr>
         <w:tc>
           <w:tcPr>

</xml_diff>